<commit_message>
style: update Template.docx company address to Tipar Cakung and sync Template.pdf
</commit_message>
<xml_diff>
--- a/Template.docx
+++ b/Template.docx
@@ -181,79 +181,7 @@
                       <w:sz w:val="22"/>
                       <w:szCs w:val="22"/>
                     </w:rPr>
-                    <w:t xml:space="preserve">Saya yang </w:t>
-                  </w:r>
-                  <w:proofErr w:type="spellStart"/>
-                  <w:r>
-                    <w:rPr>
-                      <w:rFonts w:asciiTheme="minorHAnsi" w:hAnsiTheme="minorHAnsi" w:cstheme="minorHAnsi"/>
-                      <w:sz w:val="22"/>
-                      <w:szCs w:val="22"/>
-                    </w:rPr>
-                    <w:t>bertanda</w:t>
-                  </w:r>
-                  <w:proofErr w:type="spellEnd"/>
-                  <w:r>
-                    <w:rPr>
-                      <w:rFonts w:asciiTheme="minorHAnsi" w:hAnsiTheme="minorHAnsi" w:cstheme="minorHAnsi"/>
-                      <w:sz w:val="22"/>
-                      <w:szCs w:val="22"/>
-                    </w:rPr>
-                    <w:t xml:space="preserve"> </w:t>
-                  </w:r>
-                  <w:proofErr w:type="spellStart"/>
-                  <w:r>
-                    <w:rPr>
-                      <w:rFonts w:asciiTheme="minorHAnsi" w:hAnsiTheme="minorHAnsi" w:cstheme="minorHAnsi"/>
-                      <w:sz w:val="22"/>
-                      <w:szCs w:val="22"/>
-                    </w:rPr>
-                    <w:t>tangan</w:t>
-                  </w:r>
-                  <w:proofErr w:type="spellEnd"/>
-                  <w:r>
-                    <w:rPr>
-                      <w:rFonts w:asciiTheme="minorHAnsi" w:hAnsiTheme="minorHAnsi" w:cstheme="minorHAnsi"/>
-                      <w:sz w:val="22"/>
-                      <w:szCs w:val="22"/>
-                    </w:rPr>
-                    <w:t xml:space="preserve"> di </w:t>
-                  </w:r>
-                  <w:proofErr w:type="spellStart"/>
-                  <w:r>
-                    <w:rPr>
-                      <w:rFonts w:asciiTheme="minorHAnsi" w:hAnsiTheme="minorHAnsi" w:cstheme="minorHAnsi"/>
-                      <w:sz w:val="22"/>
-                      <w:szCs w:val="22"/>
-                    </w:rPr>
-                    <w:t>bawah</w:t>
-                  </w:r>
-                  <w:proofErr w:type="spellEnd"/>
-                  <w:r>
-                    <w:rPr>
-                      <w:rFonts w:asciiTheme="minorHAnsi" w:hAnsiTheme="minorHAnsi" w:cstheme="minorHAnsi"/>
-                      <w:sz w:val="22"/>
-                      <w:szCs w:val="22"/>
-                    </w:rPr>
-                    <w:t xml:space="preserve"> </w:t>
-                  </w:r>
-                  <w:proofErr w:type="spellStart"/>
-                  <w:r>
-                    <w:rPr>
-                      <w:rFonts w:asciiTheme="minorHAnsi" w:hAnsiTheme="minorHAnsi" w:cstheme="minorHAnsi"/>
-                      <w:sz w:val="22"/>
-                      <w:szCs w:val="22"/>
-                    </w:rPr>
-                    <w:t>ini</w:t>
-                  </w:r>
-                  <w:proofErr w:type="spellEnd"/>
-                  <w:r>
-                    <w:rPr>
-                      <w:rFonts w:asciiTheme="minorHAnsi" w:hAnsiTheme="minorHAnsi" w:cstheme="minorHAnsi"/>
-                      <w:sz w:val="22"/>
-                      <w:szCs w:val="22"/>
-                    </w:rPr>
-                    <w:t>:</w:t>
+                    <w:t>Saya yang bertanda tangan di bawah ini:</w:t>
                   </w:r>
                   <w:r>
                     <w:rPr>
@@ -266,6 +194,7 @@
                 </w:p>
                 <w:p>
                   <w:pPr>
+                    <w:ind w:left="2694" w:hanging="2693"/>
                     <w:rPr>
                       <w:rFonts w:asciiTheme="minorHAnsi" w:hAnsiTheme="minorHAnsi" w:cstheme="minorHAnsi"/>
                       <w:sz w:val="22"/>
@@ -279,30 +208,6 @@
                       <w:szCs w:val="22"/>
                     </w:rPr>
                     <w:t>Nama</w:t>
-                  </w:r>
-                  <w:r>
-                    <w:rPr>
-                      <w:rFonts w:asciiTheme="minorHAnsi" w:hAnsiTheme="minorHAnsi" w:cstheme="minorHAnsi"/>
-                      <w:sz w:val="22"/>
-                      <w:szCs w:val="22"/>
-                    </w:rPr>
-                    <w:tab/>
-                  </w:r>
-                  <w:r>
-                    <w:rPr>
-                      <w:rFonts w:asciiTheme="minorHAnsi" w:hAnsiTheme="minorHAnsi" w:cstheme="minorHAnsi"/>
-                      <w:sz w:val="22"/>
-                      <w:szCs w:val="22"/>
-                    </w:rPr>
-                    <w:tab/>
-                  </w:r>
-                  <w:r>
-                    <w:rPr>
-                      <w:rFonts w:asciiTheme="minorHAnsi" w:hAnsiTheme="minorHAnsi" w:cstheme="minorHAnsi"/>
-                      <w:sz w:val="22"/>
-                      <w:szCs w:val="22"/>
-                    </w:rPr>
-                    <w:tab/>
                   </w:r>
                   <w:r>
                     <w:rPr>
@@ -325,7 +230,7 @@
                 </w:p>
                 <w:p>
                   <w:pPr>
-                    <w:ind w:left="720" w:hanging="720"/>
+                    <w:ind w:left="2694" w:hanging="2693"/>
                     <w:rPr>
                       <w:rFonts w:asciiTheme="minorHAnsi" w:hAnsiTheme="minorHAnsi" w:cstheme="minorHAnsi"/>
                       <w:sz w:val="22"/>
@@ -355,23 +260,6 @@
                       <w:sz w:val="22"/>
                       <w:szCs w:val="22"/>
                     </w:rPr>
-                    <w:tab/>
-                  </w:r>
-                  <w:r>
-                    <w:rPr>
-                      <w:rFonts w:asciiTheme="minorHAnsi" w:hAnsiTheme="minorHAnsi" w:cstheme="minorHAnsi"/>
-                      <w:sz w:val="22"/>
-                      <w:szCs w:val="22"/>
-                    </w:rPr>
-                    <w:tab/>
-                  </w:r>
-                  <w:r>
-                    <w:rPr>
-                      <w:rFonts w:asciiTheme="minorHAnsi" w:hAnsiTheme="minorHAnsi" w:cstheme="minorHAnsi"/>
-                      <w:sz w:val="22"/>
-                      <w:szCs w:val="22"/>
-                    </w:rPr>
-                    <w:tab/>
                     <w:t xml:space="preserve">: </w:t>
                   </w:r>
                   <w:r>
@@ -379,19 +267,17 @@
                       <w:rFonts w:asciiTheme="minorHAnsi" w:hAnsiTheme="minorHAnsi" w:cstheme="minorHAnsi"/>
                       <w:sz w:val="22"/>
                       <w:szCs w:val="22"/>
-                      <w:lang w:val="pt-BR"/>
-                    </w:rPr>
-                    <w:t xml:space="preserve">Kp Nagrog Rt 04 Rw 13, Ds. Babakan Peuteuy, Kec. Cicalengka, Kab. </w:t>
+                    </w:rPr>
+                    <w:t>Jl. Tipar Cakung No.6, RW.5, Cakung Bar., Kec. Cakung, Kota Jakarta Timur, Daerah Khusus Ibukota Jakarta 13910</w:t>
                   </w:r>
                 </w:p>
                 <w:p>
                   <w:pPr>
-                    <w:ind w:left="2880"/>
-                    <w:rPr>
-                      <w:rFonts w:asciiTheme="minorHAnsi" w:hAnsiTheme="minorHAnsi" w:cstheme="minorHAnsi"/>
-                      <w:sz w:val="22"/>
-                      <w:szCs w:val="22"/>
-                      <w:lang w:val="pt-BR"/>
+                    <w:ind w:left="2694" w:hanging="2693"/>
+                    <w:rPr>
+                      <w:rFonts w:asciiTheme="minorHAnsi" w:hAnsiTheme="minorHAnsi" w:cstheme="minorHAnsi"/>
+                      <w:sz w:val="22"/>
+                      <w:szCs w:val="22"/>
                     </w:rPr>
                   </w:pPr>
                   <w:r>
@@ -399,29 +285,44 @@
                       <w:rFonts w:asciiTheme="minorHAnsi" w:hAnsiTheme="minorHAnsi" w:cstheme="minorHAnsi"/>
                       <w:sz w:val="22"/>
                       <w:szCs w:val="22"/>
-                      <w:lang w:val="pt-BR"/>
-                    </w:rPr>
-                    <w:t xml:space="preserve">  Bandung</w:t>
+                    </w:rPr>
+                    <w:t>Jabatan</w:t>
+                  </w:r>
+                  <w:r>
+                    <w:rPr>
+                      <w:rFonts w:asciiTheme="minorHAnsi" w:hAnsiTheme="minorHAnsi" w:cstheme="minorHAnsi"/>
+                      <w:sz w:val="22"/>
+                      <w:szCs w:val="22"/>
+                    </w:rPr>
+                    <w:tab/>
+                    <w:t xml:space="preserve">: </w:t>
+                  </w:r>
+                  <w:r>
+                    <w:rPr>
+                      <w:rFonts w:asciiTheme="minorHAnsi" w:hAnsiTheme="minorHAnsi" w:cstheme="minorHAnsi"/>
+                      <w:sz w:val="22"/>
+                      <w:szCs w:val="22"/>
+                    </w:rPr>
+                    <w:t xml:space="preserve">Fleet Compliance Staff </w:t>
                   </w:r>
                 </w:p>
                 <w:p>
                   <w:pPr>
+                    <w:ind w:left="2694" w:hanging="2693"/>
                     <w:rPr>
                       <w:rFonts w:asciiTheme="minorHAnsi" w:hAnsiTheme="minorHAnsi" w:cstheme="minorHAnsi"/>
                       <w:sz w:val="22"/>
                       <w:szCs w:val="22"/>
                     </w:rPr>
                   </w:pPr>
-                  <w:proofErr w:type="spellStart"/>
-                  <w:r>
-                    <w:rPr>
-                      <w:rFonts w:asciiTheme="minorHAnsi" w:hAnsiTheme="minorHAnsi" w:cstheme="minorHAnsi"/>
-                      <w:sz w:val="22"/>
-                      <w:szCs w:val="22"/>
-                    </w:rPr>
-                    <w:t>Jabatan</w:t>
-                  </w:r>
-                  <w:proofErr w:type="spellEnd"/>
+                  <w:r>
+                    <w:rPr>
+                      <w:rFonts w:asciiTheme="minorHAnsi" w:hAnsiTheme="minorHAnsi" w:cstheme="minorHAnsi"/>
+                      <w:sz w:val="22"/>
+                      <w:szCs w:val="22"/>
+                    </w:rPr>
+                    <w:t>No. HP</w:t>
+                  </w:r>
                   <w:r>
                     <w:rPr>
                       <w:rFonts w:asciiTheme="minorHAnsi" w:hAnsiTheme="minorHAnsi" w:cstheme="minorHAnsi"/>
@@ -429,39 +330,15 @@
                       <w:szCs w:val="22"/>
                     </w:rPr>
                     <w:tab/>
-                  </w:r>
-                  <w:r>
-                    <w:rPr>
-                      <w:rFonts w:asciiTheme="minorHAnsi" w:hAnsiTheme="minorHAnsi" w:cstheme="minorHAnsi"/>
-                      <w:sz w:val="22"/>
-                      <w:szCs w:val="22"/>
-                    </w:rPr>
-                    <w:tab/>
-                  </w:r>
-                  <w:r>
-                    <w:rPr>
-                      <w:rFonts w:asciiTheme="minorHAnsi" w:hAnsiTheme="minorHAnsi" w:cstheme="minorHAnsi"/>
-                      <w:sz w:val="22"/>
-                      <w:szCs w:val="22"/>
-                    </w:rPr>
-                    <w:tab/>
-                  </w:r>
-                  <w:r>
-                    <w:rPr>
-                      <w:rFonts w:asciiTheme="minorHAnsi" w:hAnsiTheme="minorHAnsi" w:cstheme="minorHAnsi"/>
-                      <w:sz w:val="22"/>
-                      <w:szCs w:val="22"/>
-                    </w:rPr>
-                    <w:tab/>
-                    <w:t xml:space="preserve">: </w:t>
-                  </w:r>
-                  <w:r>
-                    <w:rPr>
-                      <w:rFonts w:asciiTheme="minorHAnsi" w:hAnsiTheme="minorHAnsi" w:cstheme="minorHAnsi"/>
-                      <w:sz w:val="22"/>
-                      <w:szCs w:val="22"/>
-                    </w:rPr>
-                    <w:t xml:space="preserve">Fleet Compliance Staff </w:t>
+                    <w:t>: 08</w:t>
+                  </w:r>
+                  <w:r>
+                    <w:rPr>
+                      <w:rFonts w:asciiTheme="minorHAnsi" w:hAnsiTheme="minorHAnsi" w:cstheme="minorHAnsi"/>
+                      <w:sz w:val="22"/>
+                      <w:szCs w:val="22"/>
+                    </w:rPr>
+                    <w:t>95389569872</w:t>
                   </w:r>
                 </w:p>
                 <w:p>
@@ -478,48 +355,16 @@
                       <w:sz w:val="22"/>
                       <w:szCs w:val="22"/>
                     </w:rPr>
-                    <w:t>No. HP</w:t>
-                  </w:r>
-                  <w:r>
-                    <w:rPr>
-                      <w:rFonts w:asciiTheme="minorHAnsi" w:hAnsiTheme="minorHAnsi" w:cstheme="minorHAnsi"/>
-                      <w:sz w:val="22"/>
-                      <w:szCs w:val="22"/>
-                    </w:rPr>
-                    <w:tab/>
-                  </w:r>
-                  <w:r>
-                    <w:rPr>
-                      <w:rFonts w:asciiTheme="minorHAnsi" w:hAnsiTheme="minorHAnsi" w:cstheme="minorHAnsi"/>
-                      <w:sz w:val="22"/>
-                      <w:szCs w:val="22"/>
-                    </w:rPr>
-                    <w:tab/>
-                  </w:r>
-                  <w:r>
-                    <w:rPr>
-                      <w:rFonts w:asciiTheme="minorHAnsi" w:hAnsiTheme="minorHAnsi" w:cstheme="minorHAnsi"/>
-                      <w:sz w:val="22"/>
-                      <w:szCs w:val="22"/>
-                    </w:rPr>
-                    <w:tab/>
-                  </w:r>
-                  <w:r>
-                    <w:rPr>
-                      <w:rFonts w:asciiTheme="minorHAnsi" w:hAnsiTheme="minorHAnsi" w:cstheme="minorHAnsi"/>
-                      <w:sz w:val="22"/>
-                      <w:szCs w:val="22"/>
-                    </w:rPr>
-                    <w:tab/>
-                    <w:t>: 08</w:t>
-                  </w:r>
-                  <w:r>
-                    <w:rPr>
-                      <w:rFonts w:asciiTheme="minorHAnsi" w:hAnsiTheme="minorHAnsi" w:cstheme="minorHAnsi"/>
-                      <w:sz w:val="22"/>
-                      <w:szCs w:val="22"/>
-                    </w:rPr>
-                    <w:t>95389569872</w:t>
+                    <w:br/>
+                    <w:t>Dengan ini menyatakan bahwa:</w:t>
+                  </w:r>
+                  <w:r>
+                    <w:rPr>
+                      <w:rFonts w:asciiTheme="minorHAnsi" w:hAnsiTheme="minorHAnsi" w:cstheme="minorHAnsi"/>
+                      <w:sz w:val="22"/>
+                      <w:szCs w:val="22"/>
+                    </w:rPr>
+                    <w:br/>
                   </w:r>
                 </w:p>
                 <w:p>
@@ -536,79 +381,7 @@
                       <w:sz w:val="22"/>
                       <w:szCs w:val="22"/>
                     </w:rPr>
-                    <w:br/>
-                  </w:r>
-                  <w:proofErr w:type="spellStart"/>
-                  <w:r>
-                    <w:rPr>
-                      <w:rFonts w:asciiTheme="minorHAnsi" w:hAnsiTheme="minorHAnsi" w:cstheme="minorHAnsi"/>
-                      <w:sz w:val="22"/>
-                      <w:szCs w:val="22"/>
-                    </w:rPr>
-                    <w:t>Dengan</w:t>
-                  </w:r>
-                  <w:proofErr w:type="spellEnd"/>
-                  <w:r>
-                    <w:rPr>
-                      <w:rFonts w:asciiTheme="minorHAnsi" w:hAnsiTheme="minorHAnsi" w:cstheme="minorHAnsi"/>
-                      <w:sz w:val="22"/>
-                      <w:szCs w:val="22"/>
-                    </w:rPr>
-                    <w:t xml:space="preserve"> </w:t>
-                  </w:r>
-                  <w:proofErr w:type="spellStart"/>
-                  <w:r>
-                    <w:rPr>
-                      <w:rFonts w:asciiTheme="minorHAnsi" w:hAnsiTheme="minorHAnsi" w:cstheme="minorHAnsi"/>
-                      <w:sz w:val="22"/>
-                      <w:szCs w:val="22"/>
-                    </w:rPr>
-                    <w:t>ini</w:t>
-                  </w:r>
-                  <w:proofErr w:type="spellEnd"/>
-                  <w:r>
-                    <w:rPr>
-                      <w:rFonts w:asciiTheme="minorHAnsi" w:hAnsiTheme="minorHAnsi" w:cstheme="minorHAnsi"/>
-                      <w:sz w:val="22"/>
-                      <w:szCs w:val="22"/>
-                    </w:rPr>
-                    <w:t xml:space="preserve"> </w:t>
-                  </w:r>
-                  <w:proofErr w:type="spellStart"/>
-                  <w:r>
-                    <w:rPr>
-                      <w:rFonts w:asciiTheme="minorHAnsi" w:hAnsiTheme="minorHAnsi" w:cstheme="minorHAnsi"/>
-                      <w:sz w:val="22"/>
-                      <w:szCs w:val="22"/>
-                    </w:rPr>
-                    <w:t>menyatakan</w:t>
-                  </w:r>
-                  <w:proofErr w:type="spellEnd"/>
-                  <w:r>
-                    <w:rPr>
-                      <w:rFonts w:asciiTheme="minorHAnsi" w:hAnsiTheme="minorHAnsi" w:cstheme="minorHAnsi"/>
-                      <w:sz w:val="22"/>
-                      <w:szCs w:val="22"/>
-                    </w:rPr>
-                    <w:t xml:space="preserve"> </w:t>
-                  </w:r>
-                  <w:proofErr w:type="spellStart"/>
-                  <w:r>
-                    <w:rPr>
-                      <w:rFonts w:asciiTheme="minorHAnsi" w:hAnsiTheme="minorHAnsi" w:cstheme="minorHAnsi"/>
-                      <w:sz w:val="22"/>
-                      <w:szCs w:val="22"/>
-                    </w:rPr>
-                    <w:t>bahwa</w:t>
-                  </w:r>
-                  <w:proofErr w:type="spellEnd"/>
-                  <w:r>
-                    <w:rPr>
-                      <w:rFonts w:asciiTheme="minorHAnsi" w:hAnsiTheme="minorHAnsi" w:cstheme="minorHAnsi"/>
-                      <w:sz w:val="22"/>
-                      <w:szCs w:val="22"/>
-                    </w:rPr>
-                    <w:t>:</w:t>
+                    <w:t>Surat Tanda Nomor Kendaraan (STNK) kendaraan dengan:</w:t>
                   </w:r>
                   <w:r>
                     <w:rPr>
@@ -633,87 +406,24 @@
                       <w:sz w:val="22"/>
                       <w:szCs w:val="22"/>
                     </w:rPr>
-                    <w:t xml:space="preserve">Surat Tanda </w:t>
-                  </w:r>
-                  <w:proofErr w:type="spellStart"/>
-                  <w:r>
-                    <w:rPr>
-                      <w:rFonts w:asciiTheme="minorHAnsi" w:hAnsiTheme="minorHAnsi" w:cstheme="minorHAnsi"/>
-                      <w:sz w:val="22"/>
-                      <w:szCs w:val="22"/>
-                    </w:rPr>
-                    <w:t>Nomor</w:t>
-                  </w:r>
-                  <w:proofErr w:type="spellEnd"/>
-                  <w:r>
-                    <w:rPr>
-                      <w:rFonts w:asciiTheme="minorHAnsi" w:hAnsiTheme="minorHAnsi" w:cstheme="minorHAnsi"/>
-                      <w:sz w:val="22"/>
-                      <w:szCs w:val="22"/>
-                    </w:rPr>
-                    <w:t xml:space="preserve"> </w:t>
-                  </w:r>
-                  <w:proofErr w:type="spellStart"/>
-                  <w:r>
-                    <w:rPr>
-                      <w:rFonts w:asciiTheme="minorHAnsi" w:hAnsiTheme="minorHAnsi" w:cstheme="minorHAnsi"/>
-                      <w:sz w:val="22"/>
-                      <w:szCs w:val="22"/>
-                    </w:rPr>
-                    <w:t>Kendaraan</w:t>
-                  </w:r>
-                  <w:proofErr w:type="spellEnd"/>
-                  <w:r>
-                    <w:rPr>
-                      <w:rFonts w:asciiTheme="minorHAnsi" w:hAnsiTheme="minorHAnsi" w:cstheme="minorHAnsi"/>
-                      <w:sz w:val="22"/>
-                      <w:szCs w:val="22"/>
-                    </w:rPr>
-                    <w:t xml:space="preserve"> (STNK) </w:t>
-                  </w:r>
-                  <w:proofErr w:type="spellStart"/>
-                  <w:r>
-                    <w:rPr>
-                      <w:rFonts w:asciiTheme="minorHAnsi" w:hAnsiTheme="minorHAnsi" w:cstheme="minorHAnsi"/>
-                      <w:sz w:val="22"/>
-                      <w:szCs w:val="22"/>
-                    </w:rPr>
-                    <w:t>kendaraan</w:t>
-                  </w:r>
-                  <w:proofErr w:type="spellEnd"/>
-                  <w:r>
-                    <w:rPr>
-                      <w:rFonts w:asciiTheme="minorHAnsi" w:hAnsiTheme="minorHAnsi" w:cstheme="minorHAnsi"/>
-                      <w:sz w:val="22"/>
-                      <w:szCs w:val="22"/>
-                    </w:rPr>
-                    <w:t xml:space="preserve"> </w:t>
-                  </w:r>
-                  <w:proofErr w:type="spellStart"/>
-                  <w:r>
-                    <w:rPr>
-                      <w:rFonts w:asciiTheme="minorHAnsi" w:hAnsiTheme="minorHAnsi" w:cstheme="minorHAnsi"/>
-                      <w:sz w:val="22"/>
-                      <w:szCs w:val="22"/>
-                    </w:rPr>
-                    <w:t>dengan</w:t>
-                  </w:r>
-                  <w:proofErr w:type="spellEnd"/>
-                  <w:r>
-                    <w:rPr>
-                      <w:rFonts w:asciiTheme="minorHAnsi" w:hAnsiTheme="minorHAnsi" w:cstheme="minorHAnsi"/>
-                      <w:sz w:val="22"/>
-                      <w:szCs w:val="22"/>
-                    </w:rPr>
-                    <w:t>:</w:t>
-                  </w:r>
-                  <w:r>
-                    <w:rPr>
-                      <w:rFonts w:asciiTheme="minorHAnsi" w:hAnsiTheme="minorHAnsi" w:cstheme="minorHAnsi"/>
-                      <w:sz w:val="22"/>
-                      <w:szCs w:val="22"/>
-                    </w:rPr>
-                    <w:br/>
+                    <w:t>Nomor Polisi</w:t>
+                  </w:r>
+                  <w:r>
+                    <w:rPr>
+                      <w:rFonts w:asciiTheme="minorHAnsi" w:hAnsiTheme="minorHAnsi" w:cstheme="minorHAnsi"/>
+                      <w:sz w:val="22"/>
+                      <w:szCs w:val="22"/>
+                    </w:rPr>
+                    <w:tab/>
+                  </w:r>
+                  <w:r>
+                    <w:rPr>
+                      <w:rFonts w:asciiTheme="minorHAnsi" w:hAnsiTheme="minorHAnsi" w:cstheme="minorHAnsi"/>
+                      <w:sz w:val="22"/>
+                      <w:szCs w:val="22"/>
+                    </w:rPr>
+                    <w:tab/>
+                    <w:t xml:space="preserve">: </w:t>
                   </w:r>
                 </w:p>
                 <w:p>
@@ -724,23 +434,13 @@
                       <w:szCs w:val="22"/>
                     </w:rPr>
                   </w:pPr>
-                  <w:proofErr w:type="spellStart"/>
-                  <w:r>
-                    <w:rPr>
-                      <w:rFonts w:asciiTheme="minorHAnsi" w:hAnsiTheme="minorHAnsi" w:cstheme="minorHAnsi"/>
-                      <w:sz w:val="22"/>
-                      <w:szCs w:val="22"/>
-                    </w:rPr>
-                    <w:t>Nomor</w:t>
-                  </w:r>
-                  <w:proofErr w:type="spellEnd"/>
-                  <w:r>
-                    <w:rPr>
-                      <w:rFonts w:asciiTheme="minorHAnsi" w:hAnsiTheme="minorHAnsi" w:cstheme="minorHAnsi"/>
-                      <w:sz w:val="22"/>
-                      <w:szCs w:val="22"/>
-                    </w:rPr>
-                    <w:t xml:space="preserve"> Polisi</w:t>
+                  <w:r>
+                    <w:rPr>
+                      <w:rFonts w:asciiTheme="minorHAnsi" w:hAnsiTheme="minorHAnsi" w:cstheme="minorHAnsi"/>
+                      <w:sz w:val="22"/>
+                      <w:szCs w:val="22"/>
+                    </w:rPr>
+                    <w:t>Merk / Tipe</w:t>
                   </w:r>
                   <w:r>
                     <w:rPr>
@@ -758,15 +458,6 @@
                     </w:rPr>
                     <w:tab/>
                     <w:t xml:space="preserve">: </w:t>
-                  </w:r>
-                  <w:r>
-                    <w:rPr>
-                      <w:rFonts w:ascii="Arial" w:hAnsi="Arial"/>
-                      <w:b/>
-                      <w:bCs/>
-                      <w:color w:val="000000"/>
-                    </w:rPr>
-                    <w:t>B 9987 TXV</w:t>
                   </w:r>
                 </w:p>
                 <w:p>
@@ -783,18 +474,16 @@
                       <w:sz w:val="22"/>
                       <w:szCs w:val="22"/>
                     </w:rPr>
-                    <w:t xml:space="preserve">Merk / </w:t>
-                  </w:r>
-                  <w:proofErr w:type="spellStart"/>
-                  <w:r>
-                    <w:rPr>
-                      <w:rFonts w:asciiTheme="minorHAnsi" w:hAnsiTheme="minorHAnsi" w:cstheme="minorHAnsi"/>
-                      <w:sz w:val="22"/>
-                      <w:szCs w:val="22"/>
-                    </w:rPr>
-                    <w:t>Tipe</w:t>
-                  </w:r>
-                  <w:proofErr w:type="spellEnd"/>
+                    <w:t>Tahun</w:t>
+                  </w:r>
+                  <w:r>
+                    <w:rPr>
+                      <w:rFonts w:asciiTheme="minorHAnsi" w:hAnsiTheme="minorHAnsi" w:cstheme="minorHAnsi"/>
+                      <w:sz w:val="22"/>
+                      <w:szCs w:val="22"/>
+                    </w:rPr>
+                    <w:tab/>
+                  </w:r>
                   <w:r>
                     <w:rPr>
                       <w:rFonts w:asciiTheme="minorHAnsi" w:hAnsiTheme="minorHAnsi" w:cstheme="minorHAnsi"/>
@@ -811,14 +500,6 @@
                     </w:rPr>
                     <w:tab/>
                     <w:t xml:space="preserve">: </w:t>
-                  </w:r>
-                  <w:r>
-                    <w:rPr>
-                      <w:rFonts w:asciiTheme="minorHAnsi" w:hAnsiTheme="minorHAnsi" w:cstheme="minorHAnsi"/>
-                      <w:sz w:val="22"/>
-                      <w:szCs w:val="22"/>
-                    </w:rPr>
-                    <w:t>HINO</w:t>
                   </w:r>
                 </w:p>
                 <w:p>
@@ -829,16 +510,14 @@
                       <w:szCs w:val="22"/>
                     </w:rPr>
                   </w:pPr>
-                  <w:proofErr w:type="spellStart"/>
-                  <w:r>
-                    <w:rPr>
-                      <w:rFonts w:asciiTheme="minorHAnsi" w:hAnsiTheme="minorHAnsi" w:cstheme="minorHAnsi"/>
-                      <w:sz w:val="22"/>
-                      <w:szCs w:val="22"/>
-                    </w:rPr>
-                    <w:t>Tahun</w:t>
-                  </w:r>
-                  <w:proofErr w:type="spellEnd"/>
+                  <w:r>
+                    <w:rPr>
+                      <w:rFonts w:asciiTheme="minorHAnsi" w:hAnsiTheme="minorHAnsi" w:cstheme="minorHAnsi"/>
+                      <w:sz w:val="22"/>
+                      <w:szCs w:val="22"/>
+                    </w:rPr>
+                    <w:t>Warna</w:t>
+                  </w:r>
                   <w:r>
                     <w:rPr>
                       <w:rFonts w:asciiTheme="minorHAnsi" w:hAnsiTheme="minorHAnsi" w:cstheme="minorHAnsi"/>
@@ -863,22 +542,6 @@
                     </w:rPr>
                     <w:tab/>
                     <w:t xml:space="preserve">: </w:t>
-                  </w:r>
-                  <w:r>
-                    <w:rPr>
-                      <w:rFonts w:asciiTheme="minorHAnsi" w:hAnsiTheme="minorHAnsi" w:cstheme="minorHAnsi"/>
-                      <w:sz w:val="22"/>
-                      <w:szCs w:val="22"/>
-                    </w:rPr>
-                    <w:t>20</w:t>
-                  </w:r>
-                  <w:r>
-                    <w:rPr>
-                      <w:rFonts w:asciiTheme="minorHAnsi" w:hAnsiTheme="minorHAnsi" w:cstheme="minorHAnsi"/>
-                      <w:sz w:val="22"/>
-                      <w:szCs w:val="22"/>
-                    </w:rPr>
-                    <w:t>22</w:t>
                   </w:r>
                 </w:p>
                 <w:p>
@@ -895,7 +558,7 @@
                       <w:sz w:val="22"/>
                       <w:szCs w:val="22"/>
                     </w:rPr>
-                    <w:t>Warna</w:t>
+                    <w:t>Nomor Rangka</w:t>
                   </w:r>
                   <w:r>
                     <w:rPr>
@@ -912,15 +575,7 @@
                       <w:szCs w:val="22"/>
                     </w:rPr>
                     <w:tab/>
-                  </w:r>
-                  <w:r>
-                    <w:rPr>
-                      <w:rFonts w:asciiTheme="minorHAnsi" w:hAnsiTheme="minorHAnsi" w:cstheme="minorHAnsi"/>
-                      <w:sz w:val="22"/>
-                      <w:szCs w:val="22"/>
-                    </w:rPr>
-                    <w:tab/>
-                    <w:t>: MERAH</w:t>
+                    <w:t xml:space="preserve">: </w:t>
                   </w:r>
                 </w:p>
                 <w:p>
@@ -931,23 +586,13 @@
                       <w:szCs w:val="22"/>
                     </w:rPr>
                   </w:pPr>
-                  <w:proofErr w:type="spellStart"/>
-                  <w:r>
-                    <w:rPr>
-                      <w:rFonts w:asciiTheme="minorHAnsi" w:hAnsiTheme="minorHAnsi" w:cstheme="minorHAnsi"/>
-                      <w:sz w:val="22"/>
-                      <w:szCs w:val="22"/>
-                    </w:rPr>
-                    <w:t>Nomor</w:t>
-                  </w:r>
-                  <w:proofErr w:type="spellEnd"/>
-                  <w:r>
-                    <w:rPr>
-                      <w:rFonts w:asciiTheme="minorHAnsi" w:hAnsiTheme="minorHAnsi" w:cstheme="minorHAnsi"/>
-                      <w:sz w:val="22"/>
-                      <w:szCs w:val="22"/>
-                    </w:rPr>
-                    <w:t xml:space="preserve"> Rangka</w:t>
+                  <w:r>
+                    <w:rPr>
+                      <w:rFonts w:asciiTheme="minorHAnsi" w:hAnsiTheme="minorHAnsi" w:cstheme="minorHAnsi"/>
+                      <w:sz w:val="22"/>
+                      <w:szCs w:val="22"/>
+                    </w:rPr>
+                    <w:t>Nomor Mesin</w:t>
                   </w:r>
                   <w:r>
                     <w:rPr>
@@ -965,12 +610,6 @@
                     </w:rPr>
                     <w:tab/>
                     <w:t xml:space="preserve">: </w:t>
-                  </w:r>
-                  <w:r>
-                    <w:rPr>
-                      <w:rFonts w:ascii="Arial" w:hAnsi="Arial"/>
-                    </w:rPr>
-                    <w:t>MJEFG8JS2NJP10291</w:t>
                   </w:r>
                 </w:p>
                 <w:p>
@@ -981,56 +620,38 @@
                       <w:szCs w:val="22"/>
                     </w:rPr>
                   </w:pPr>
-                  <w:proofErr w:type="spellStart"/>
-                  <w:r>
-                    <w:rPr>
-                      <w:rFonts w:asciiTheme="minorHAnsi" w:hAnsiTheme="minorHAnsi" w:cstheme="minorHAnsi"/>
-                      <w:sz w:val="22"/>
-                      <w:szCs w:val="22"/>
-                    </w:rPr>
-                    <w:t>Nomor</w:t>
-                  </w:r>
-                  <w:proofErr w:type="spellEnd"/>
-                  <w:r>
-                    <w:rPr>
-                      <w:rFonts w:asciiTheme="minorHAnsi" w:hAnsiTheme="minorHAnsi" w:cstheme="minorHAnsi"/>
-                      <w:sz w:val="22"/>
-                      <w:szCs w:val="22"/>
-                    </w:rPr>
-                    <w:t xml:space="preserve"> </w:t>
-                  </w:r>
-                  <w:proofErr w:type="spellStart"/>
-                  <w:r>
-                    <w:rPr>
-                      <w:rFonts w:asciiTheme="minorHAnsi" w:hAnsiTheme="minorHAnsi" w:cstheme="minorHAnsi"/>
-                      <w:sz w:val="22"/>
-                      <w:szCs w:val="22"/>
-                    </w:rPr>
-                    <w:t>Mesin</w:t>
-                  </w:r>
-                  <w:proofErr w:type="spellEnd"/>
-                  <w:r>
-                    <w:rPr>
-                      <w:rFonts w:asciiTheme="minorHAnsi" w:hAnsiTheme="minorHAnsi" w:cstheme="minorHAnsi"/>
-                      <w:sz w:val="22"/>
-                      <w:szCs w:val="22"/>
-                    </w:rPr>
-                    <w:tab/>
-                  </w:r>
-                  <w:r>
-                    <w:rPr>
-                      <w:rFonts w:asciiTheme="minorHAnsi" w:hAnsiTheme="minorHAnsi" w:cstheme="minorHAnsi"/>
-                      <w:sz w:val="22"/>
-                      <w:szCs w:val="22"/>
-                    </w:rPr>
-                    <w:tab/>
-                    <w:t xml:space="preserve">: </w:t>
-                  </w:r>
-                  <w:r>
-                    <w:rPr>
-                      <w:rFonts w:ascii="Arial" w:hAnsi="Arial"/>
-                    </w:rPr>
-                    <w:t>J08EWEJ13720</w:t>
+                  <w:r>
+                    <w:rPr>
+                      <w:rFonts w:asciiTheme="minorHAnsi" w:hAnsiTheme="minorHAnsi" w:cstheme="minorHAnsi"/>
+                      <w:sz w:val="22"/>
+                      <w:szCs w:val="22"/>
+                    </w:rPr>
+                    <w:br/>
+                    <w:t>Saat ini sedang dalam proses perpanjangan melalui biro jasa</w:t>
+                  </w:r>
+                  <w:r>
+                    <w:rPr>
+                      <w:rFonts w:asciiTheme="minorHAnsi" w:hAnsiTheme="minorHAnsi" w:cstheme="minorHAnsi"/>
+                      <w:sz w:val="22"/>
+                      <w:szCs w:val="22"/>
+                    </w:rPr>
+                    <w:t xml:space="preserve"> Bontonk</w:t>
+                  </w:r>
+                  <w:r>
+                    <w:rPr>
+                      <w:rFonts w:asciiTheme="minorHAnsi" w:hAnsiTheme="minorHAnsi" w:cstheme="minorHAnsi"/>
+                      <w:sz w:val="22"/>
+                      <w:szCs w:val="22"/>
+                    </w:rPr>
+                    <w:t>.</w:t>
+                  </w:r>
+                  <w:r>
+                    <w:rPr>
+                      <w:rFonts w:asciiTheme="minorHAnsi" w:hAnsiTheme="minorHAnsi" w:cstheme="minorHAnsi"/>
+                      <w:sz w:val="22"/>
+                      <w:szCs w:val="22"/>
+                    </w:rPr>
+                    <w:br/>
                   </w:r>
                 </w:p>
                 <w:p>
@@ -1047,134 +668,7 @@
                       <w:sz w:val="22"/>
                       <w:szCs w:val="22"/>
                     </w:rPr>
-                    <w:br/>
-                    <w:t xml:space="preserve">Saat </w:t>
-                  </w:r>
-                  <w:proofErr w:type="spellStart"/>
-                  <w:r>
-                    <w:rPr>
-                      <w:rFonts w:asciiTheme="minorHAnsi" w:hAnsiTheme="minorHAnsi" w:cstheme="minorHAnsi"/>
-                      <w:sz w:val="22"/>
-                      <w:szCs w:val="22"/>
-                    </w:rPr>
-                    <w:t>ini</w:t>
-                  </w:r>
-                  <w:proofErr w:type="spellEnd"/>
-                  <w:r>
-                    <w:rPr>
-                      <w:rFonts w:asciiTheme="minorHAnsi" w:hAnsiTheme="minorHAnsi" w:cstheme="minorHAnsi"/>
-                      <w:sz w:val="22"/>
-                      <w:szCs w:val="22"/>
-                    </w:rPr>
-                    <w:t xml:space="preserve"> </w:t>
-                  </w:r>
-                  <w:proofErr w:type="spellStart"/>
-                  <w:r>
-                    <w:rPr>
-                      <w:rFonts w:asciiTheme="minorHAnsi" w:hAnsiTheme="minorHAnsi" w:cstheme="minorHAnsi"/>
-                      <w:sz w:val="22"/>
-                      <w:szCs w:val="22"/>
-                    </w:rPr>
-                    <w:t>sedang</w:t>
-                  </w:r>
-                  <w:proofErr w:type="spellEnd"/>
-                  <w:r>
-                    <w:rPr>
-                      <w:rFonts w:asciiTheme="minorHAnsi" w:hAnsiTheme="minorHAnsi" w:cstheme="minorHAnsi"/>
-                      <w:sz w:val="22"/>
-                      <w:szCs w:val="22"/>
-                    </w:rPr>
-                    <w:t xml:space="preserve"> </w:t>
-                  </w:r>
-                  <w:proofErr w:type="spellStart"/>
-                  <w:r>
-                    <w:rPr>
-                      <w:rFonts w:asciiTheme="minorHAnsi" w:hAnsiTheme="minorHAnsi" w:cstheme="minorHAnsi"/>
-                      <w:sz w:val="22"/>
-                      <w:szCs w:val="22"/>
-                    </w:rPr>
-                    <w:t>dalam</w:t>
-                  </w:r>
-                  <w:proofErr w:type="spellEnd"/>
-                  <w:r>
-                    <w:rPr>
-                      <w:rFonts w:asciiTheme="minorHAnsi" w:hAnsiTheme="minorHAnsi" w:cstheme="minorHAnsi"/>
-                      <w:sz w:val="22"/>
-                      <w:szCs w:val="22"/>
-                    </w:rPr>
-                    <w:t xml:space="preserve"> proses </w:t>
-                  </w:r>
-                  <w:proofErr w:type="spellStart"/>
-                  <w:r>
-                    <w:rPr>
-                      <w:rFonts w:asciiTheme="minorHAnsi" w:hAnsiTheme="minorHAnsi" w:cstheme="minorHAnsi"/>
-                      <w:sz w:val="22"/>
-                      <w:szCs w:val="22"/>
-                    </w:rPr>
-                    <w:t>perpanjangan</w:t>
-                  </w:r>
-                  <w:proofErr w:type="spellEnd"/>
-                  <w:r>
-                    <w:rPr>
-                      <w:rFonts w:asciiTheme="minorHAnsi" w:hAnsiTheme="minorHAnsi" w:cstheme="minorHAnsi"/>
-                      <w:sz w:val="22"/>
-                      <w:szCs w:val="22"/>
-                    </w:rPr>
-                    <w:t xml:space="preserve"> </w:t>
-                  </w:r>
-                  <w:proofErr w:type="spellStart"/>
-                  <w:r>
-                    <w:rPr>
-                      <w:rFonts w:asciiTheme="minorHAnsi" w:hAnsiTheme="minorHAnsi" w:cstheme="minorHAnsi"/>
-                      <w:sz w:val="22"/>
-                      <w:szCs w:val="22"/>
-                    </w:rPr>
-                    <w:t>melalui</w:t>
-                  </w:r>
-                  <w:proofErr w:type="spellEnd"/>
-                  <w:r>
-                    <w:rPr>
-                      <w:rFonts w:asciiTheme="minorHAnsi" w:hAnsiTheme="minorHAnsi" w:cstheme="minorHAnsi"/>
-                      <w:sz w:val="22"/>
-                      <w:szCs w:val="22"/>
-                    </w:rPr>
-                    <w:t xml:space="preserve"> biro </w:t>
-                  </w:r>
-                  <w:proofErr w:type="spellStart"/>
-                  <w:r>
-                    <w:rPr>
-                      <w:rFonts w:asciiTheme="minorHAnsi" w:hAnsiTheme="minorHAnsi" w:cstheme="minorHAnsi"/>
-                      <w:sz w:val="22"/>
-                      <w:szCs w:val="22"/>
-                    </w:rPr>
-                    <w:t>jasa</w:t>
-                  </w:r>
-                  <w:proofErr w:type="spellEnd"/>
-                  <w:r>
-                    <w:rPr>
-                      <w:rFonts w:asciiTheme="minorHAnsi" w:hAnsiTheme="minorHAnsi" w:cstheme="minorHAnsi"/>
-                      <w:sz w:val="22"/>
-                      <w:szCs w:val="22"/>
-                    </w:rPr>
-                    <w:t xml:space="preserve"> </w:t>
-                  </w:r>
-                  <w:proofErr w:type="spellStart"/>
-                  <w:r>
-                    <w:rPr>
-                      <w:rFonts w:asciiTheme="minorHAnsi" w:hAnsiTheme="minorHAnsi" w:cstheme="minorHAnsi"/>
-                      <w:sz w:val="22"/>
-                      <w:szCs w:val="22"/>
-                    </w:rPr>
-                    <w:t>Bontonk</w:t>
-                  </w:r>
-                  <w:proofErr w:type="spellEnd"/>
-                  <w:r>
-                    <w:rPr>
-                      <w:rFonts w:asciiTheme="minorHAnsi" w:hAnsiTheme="minorHAnsi" w:cstheme="minorHAnsi"/>
-                      <w:sz w:val="22"/>
-                      <w:szCs w:val="22"/>
-                    </w:rPr>
-                    <w:t>.</w:t>
+                    <w:t>Demikian surat pernyataan ini saya buat dengan sebenar-benarnya untuk dapat digunakan sebagaimana mestinya. Apabila di kemudian hari terdapat hal-hal yang tidak sesuai dengan pernyataan ini, saya bersedia bertanggung jawab sepenuhnya.</w:t>
                   </w:r>
                   <w:r>
                     <w:rPr>
@@ -1193,517 +687,13 @@
                       <w:szCs w:val="22"/>
                     </w:rPr>
                   </w:pPr>
-                  <w:proofErr w:type="spellStart"/>
-                  <w:r>
-                    <w:rPr>
-                      <w:rFonts w:asciiTheme="minorHAnsi" w:hAnsiTheme="minorHAnsi" w:cstheme="minorHAnsi"/>
-                      <w:sz w:val="22"/>
-                      <w:szCs w:val="22"/>
-                    </w:rPr>
-                    <w:t>Demikian</w:t>
-                  </w:r>
-                  <w:proofErr w:type="spellEnd"/>
-                  <w:r>
-                    <w:rPr>
-                      <w:rFonts w:asciiTheme="minorHAnsi" w:hAnsiTheme="minorHAnsi" w:cstheme="minorHAnsi"/>
-                      <w:sz w:val="22"/>
-                      <w:szCs w:val="22"/>
-                    </w:rPr>
-                    <w:t xml:space="preserve"> </w:t>
-                  </w:r>
-                  <w:proofErr w:type="spellStart"/>
-                  <w:r>
-                    <w:rPr>
-                      <w:rFonts w:asciiTheme="minorHAnsi" w:hAnsiTheme="minorHAnsi" w:cstheme="minorHAnsi"/>
-                      <w:sz w:val="22"/>
-                      <w:szCs w:val="22"/>
-                    </w:rPr>
-                    <w:t>surat</w:t>
-                  </w:r>
-                  <w:proofErr w:type="spellEnd"/>
-                  <w:r>
-                    <w:rPr>
-                      <w:rFonts w:asciiTheme="minorHAnsi" w:hAnsiTheme="minorHAnsi" w:cstheme="minorHAnsi"/>
-                      <w:sz w:val="22"/>
-                      <w:szCs w:val="22"/>
-                    </w:rPr>
-                    <w:t xml:space="preserve"> </w:t>
-                  </w:r>
-                  <w:proofErr w:type="spellStart"/>
-                  <w:r>
-                    <w:rPr>
-                      <w:rFonts w:asciiTheme="minorHAnsi" w:hAnsiTheme="minorHAnsi" w:cstheme="minorHAnsi"/>
-                      <w:sz w:val="22"/>
-                      <w:szCs w:val="22"/>
-                    </w:rPr>
-                    <w:t>pernyataan</w:t>
-                  </w:r>
-                  <w:proofErr w:type="spellEnd"/>
-                  <w:r>
-                    <w:rPr>
-                      <w:rFonts w:asciiTheme="minorHAnsi" w:hAnsiTheme="minorHAnsi" w:cstheme="minorHAnsi"/>
-                      <w:sz w:val="22"/>
-                      <w:szCs w:val="22"/>
-                    </w:rPr>
-                    <w:t xml:space="preserve"> </w:t>
-                  </w:r>
-                  <w:proofErr w:type="spellStart"/>
-                  <w:r>
-                    <w:rPr>
-                      <w:rFonts w:asciiTheme="minorHAnsi" w:hAnsiTheme="minorHAnsi" w:cstheme="minorHAnsi"/>
-                      <w:sz w:val="22"/>
-                      <w:szCs w:val="22"/>
-                    </w:rPr>
-                    <w:t>ini</w:t>
-                  </w:r>
-                  <w:proofErr w:type="spellEnd"/>
-                  <w:r>
-                    <w:rPr>
-                      <w:rFonts w:asciiTheme="minorHAnsi" w:hAnsiTheme="minorHAnsi" w:cstheme="minorHAnsi"/>
-                      <w:sz w:val="22"/>
-                      <w:szCs w:val="22"/>
-                    </w:rPr>
-                    <w:t xml:space="preserve"> </w:t>
-                  </w:r>
-                  <w:proofErr w:type="spellStart"/>
-                  <w:r>
-                    <w:rPr>
-                      <w:rFonts w:asciiTheme="minorHAnsi" w:hAnsiTheme="minorHAnsi" w:cstheme="minorHAnsi"/>
-                      <w:sz w:val="22"/>
-                      <w:szCs w:val="22"/>
-                    </w:rPr>
-                    <w:t>saya</w:t>
-                  </w:r>
-                  <w:proofErr w:type="spellEnd"/>
-                  <w:r>
-                    <w:rPr>
-                      <w:rFonts w:asciiTheme="minorHAnsi" w:hAnsiTheme="minorHAnsi" w:cstheme="minorHAnsi"/>
-                      <w:sz w:val="22"/>
-                      <w:szCs w:val="22"/>
-                    </w:rPr>
-                    <w:t xml:space="preserve"> </w:t>
-                  </w:r>
-                  <w:proofErr w:type="spellStart"/>
-                  <w:r>
-                    <w:rPr>
-                      <w:rFonts w:asciiTheme="minorHAnsi" w:hAnsiTheme="minorHAnsi" w:cstheme="minorHAnsi"/>
-                      <w:sz w:val="22"/>
-                      <w:szCs w:val="22"/>
-                    </w:rPr>
-                    <w:t>buat</w:t>
-                  </w:r>
-                  <w:proofErr w:type="spellEnd"/>
-                  <w:r>
-                    <w:rPr>
-                      <w:rFonts w:asciiTheme="minorHAnsi" w:hAnsiTheme="minorHAnsi" w:cstheme="minorHAnsi"/>
-                      <w:sz w:val="22"/>
-                      <w:szCs w:val="22"/>
-                    </w:rPr>
-                    <w:t xml:space="preserve"> </w:t>
-                  </w:r>
-                  <w:proofErr w:type="spellStart"/>
-                  <w:r>
-                    <w:rPr>
-                      <w:rFonts w:asciiTheme="minorHAnsi" w:hAnsiTheme="minorHAnsi" w:cstheme="minorHAnsi"/>
-                      <w:sz w:val="22"/>
-                      <w:szCs w:val="22"/>
-                    </w:rPr>
-                    <w:t>dengan</w:t>
-                  </w:r>
-                  <w:proofErr w:type="spellEnd"/>
-                  <w:r>
-                    <w:rPr>
-                      <w:rFonts w:asciiTheme="minorHAnsi" w:hAnsiTheme="minorHAnsi" w:cstheme="minorHAnsi"/>
-                      <w:sz w:val="22"/>
-                      <w:szCs w:val="22"/>
-                    </w:rPr>
-                    <w:t xml:space="preserve"> </w:t>
-                  </w:r>
-                  <w:proofErr w:type="spellStart"/>
-                  <w:r>
-                    <w:rPr>
-                      <w:rFonts w:asciiTheme="minorHAnsi" w:hAnsiTheme="minorHAnsi" w:cstheme="minorHAnsi"/>
-                      <w:sz w:val="22"/>
-                      <w:szCs w:val="22"/>
-                    </w:rPr>
-                    <w:t>sebenar-benarnya</w:t>
-                  </w:r>
-                  <w:proofErr w:type="spellEnd"/>
-                  <w:r>
-                    <w:rPr>
-                      <w:rFonts w:asciiTheme="minorHAnsi" w:hAnsiTheme="minorHAnsi" w:cstheme="minorHAnsi"/>
-                      <w:sz w:val="22"/>
-                      <w:szCs w:val="22"/>
-                    </w:rPr>
-                    <w:t xml:space="preserve"> </w:t>
-                  </w:r>
-                  <w:proofErr w:type="spellStart"/>
-                  <w:r>
-                    <w:rPr>
-                      <w:rFonts w:asciiTheme="minorHAnsi" w:hAnsiTheme="minorHAnsi" w:cstheme="minorHAnsi"/>
-                      <w:sz w:val="22"/>
-                      <w:szCs w:val="22"/>
-                    </w:rPr>
-                    <w:t>untuk</w:t>
-                  </w:r>
-                  <w:proofErr w:type="spellEnd"/>
-                  <w:r>
-                    <w:rPr>
-                      <w:rFonts w:asciiTheme="minorHAnsi" w:hAnsiTheme="minorHAnsi" w:cstheme="minorHAnsi"/>
-                      <w:sz w:val="22"/>
-                      <w:szCs w:val="22"/>
-                    </w:rPr>
-                    <w:t xml:space="preserve"> </w:t>
-                  </w:r>
-                  <w:proofErr w:type="spellStart"/>
-                  <w:r>
-                    <w:rPr>
-                      <w:rFonts w:asciiTheme="minorHAnsi" w:hAnsiTheme="minorHAnsi" w:cstheme="minorHAnsi"/>
-                      <w:sz w:val="22"/>
-                      <w:szCs w:val="22"/>
-                    </w:rPr>
-                    <w:t>dapat</w:t>
-                  </w:r>
-                  <w:proofErr w:type="spellEnd"/>
-                  <w:r>
-                    <w:rPr>
-                      <w:rFonts w:asciiTheme="minorHAnsi" w:hAnsiTheme="minorHAnsi" w:cstheme="minorHAnsi"/>
-                      <w:sz w:val="22"/>
-                      <w:szCs w:val="22"/>
-                    </w:rPr>
-                    <w:t xml:space="preserve"> </w:t>
-                  </w:r>
-                  <w:proofErr w:type="spellStart"/>
-                  <w:r>
-                    <w:rPr>
-                      <w:rFonts w:asciiTheme="minorHAnsi" w:hAnsiTheme="minorHAnsi" w:cstheme="minorHAnsi"/>
-                      <w:sz w:val="22"/>
-                      <w:szCs w:val="22"/>
-                    </w:rPr>
-                    <w:t>digunakan</w:t>
-                  </w:r>
-                  <w:proofErr w:type="spellEnd"/>
-                  <w:r>
-                    <w:rPr>
-                      <w:rFonts w:asciiTheme="minorHAnsi" w:hAnsiTheme="minorHAnsi" w:cstheme="minorHAnsi"/>
-                      <w:sz w:val="22"/>
-                      <w:szCs w:val="22"/>
-                    </w:rPr>
-                    <w:t xml:space="preserve"> </w:t>
-                  </w:r>
-                  <w:proofErr w:type="spellStart"/>
-                  <w:r>
-                    <w:rPr>
-                      <w:rFonts w:asciiTheme="minorHAnsi" w:hAnsiTheme="minorHAnsi" w:cstheme="minorHAnsi"/>
-                      <w:sz w:val="22"/>
-                      <w:szCs w:val="22"/>
-                    </w:rPr>
-                    <w:t>sebagaimana</w:t>
-                  </w:r>
-                  <w:proofErr w:type="spellEnd"/>
-                  <w:r>
-                    <w:rPr>
-                      <w:rFonts w:asciiTheme="minorHAnsi" w:hAnsiTheme="minorHAnsi" w:cstheme="minorHAnsi"/>
-                      <w:sz w:val="22"/>
-                      <w:szCs w:val="22"/>
-                    </w:rPr>
-                    <w:t xml:space="preserve"> </w:t>
-                  </w:r>
-                  <w:proofErr w:type="spellStart"/>
-                  <w:r>
-                    <w:rPr>
-                      <w:rFonts w:asciiTheme="minorHAnsi" w:hAnsiTheme="minorHAnsi" w:cstheme="minorHAnsi"/>
-                      <w:sz w:val="22"/>
-                      <w:szCs w:val="22"/>
-                    </w:rPr>
-                    <w:t>mestinya</w:t>
-                  </w:r>
-                  <w:proofErr w:type="spellEnd"/>
-                  <w:r>
-                    <w:rPr>
-                      <w:rFonts w:asciiTheme="minorHAnsi" w:hAnsiTheme="minorHAnsi" w:cstheme="minorHAnsi"/>
-                      <w:sz w:val="22"/>
-                      <w:szCs w:val="22"/>
-                    </w:rPr>
-                    <w:t xml:space="preserve">. </w:t>
-                  </w:r>
-                  <w:proofErr w:type="spellStart"/>
-                  <w:r>
-                    <w:rPr>
-                      <w:rFonts w:asciiTheme="minorHAnsi" w:hAnsiTheme="minorHAnsi" w:cstheme="minorHAnsi"/>
-                      <w:sz w:val="22"/>
-                      <w:szCs w:val="22"/>
-                    </w:rPr>
-                    <w:t>Apabila</w:t>
-                  </w:r>
-                  <w:proofErr w:type="spellEnd"/>
-                  <w:r>
-                    <w:rPr>
-                      <w:rFonts w:asciiTheme="minorHAnsi" w:hAnsiTheme="minorHAnsi" w:cstheme="minorHAnsi"/>
-                      <w:sz w:val="22"/>
-                      <w:szCs w:val="22"/>
-                    </w:rPr>
-                    <w:t xml:space="preserve"> di </w:t>
-                  </w:r>
-                  <w:proofErr w:type="spellStart"/>
-                  <w:r>
-                    <w:rPr>
-                      <w:rFonts w:asciiTheme="minorHAnsi" w:hAnsiTheme="minorHAnsi" w:cstheme="minorHAnsi"/>
-                      <w:sz w:val="22"/>
-                      <w:szCs w:val="22"/>
-                    </w:rPr>
-                    <w:t>kemudian</w:t>
-                  </w:r>
-                  <w:proofErr w:type="spellEnd"/>
-                  <w:r>
-                    <w:rPr>
-                      <w:rFonts w:asciiTheme="minorHAnsi" w:hAnsiTheme="minorHAnsi" w:cstheme="minorHAnsi"/>
-                      <w:sz w:val="22"/>
-                      <w:szCs w:val="22"/>
-                    </w:rPr>
-                    <w:t xml:space="preserve"> </w:t>
-                  </w:r>
-                  <w:proofErr w:type="spellStart"/>
-                  <w:r>
-                    <w:rPr>
-                      <w:rFonts w:asciiTheme="minorHAnsi" w:hAnsiTheme="minorHAnsi" w:cstheme="minorHAnsi"/>
-                      <w:sz w:val="22"/>
-                      <w:szCs w:val="22"/>
-                    </w:rPr>
-                    <w:t>hari</w:t>
-                  </w:r>
-                  <w:proofErr w:type="spellEnd"/>
-                  <w:r>
-                    <w:rPr>
-                      <w:rFonts w:asciiTheme="minorHAnsi" w:hAnsiTheme="minorHAnsi" w:cstheme="minorHAnsi"/>
-                      <w:sz w:val="22"/>
-                      <w:szCs w:val="22"/>
-                    </w:rPr>
-                    <w:t xml:space="preserve"> </w:t>
-                  </w:r>
-                  <w:proofErr w:type="spellStart"/>
-                  <w:r>
-                    <w:rPr>
-                      <w:rFonts w:asciiTheme="minorHAnsi" w:hAnsiTheme="minorHAnsi" w:cstheme="minorHAnsi"/>
-                      <w:sz w:val="22"/>
-                      <w:szCs w:val="22"/>
-                    </w:rPr>
-                    <w:t>terdapat</w:t>
-                  </w:r>
-                  <w:proofErr w:type="spellEnd"/>
-                  <w:r>
-                    <w:rPr>
-                      <w:rFonts w:asciiTheme="minorHAnsi" w:hAnsiTheme="minorHAnsi" w:cstheme="minorHAnsi"/>
-                      <w:sz w:val="22"/>
-                      <w:szCs w:val="22"/>
-                    </w:rPr>
-                    <w:t xml:space="preserve"> </w:t>
-                  </w:r>
-                  <w:proofErr w:type="spellStart"/>
-                  <w:r>
-                    <w:rPr>
-                      <w:rFonts w:asciiTheme="minorHAnsi" w:hAnsiTheme="minorHAnsi" w:cstheme="minorHAnsi"/>
-                      <w:sz w:val="22"/>
-                      <w:szCs w:val="22"/>
-                    </w:rPr>
-                    <w:t>hal-hal</w:t>
-                  </w:r>
-                  <w:proofErr w:type="spellEnd"/>
-                  <w:r>
-                    <w:rPr>
-                      <w:rFonts w:asciiTheme="minorHAnsi" w:hAnsiTheme="minorHAnsi" w:cstheme="minorHAnsi"/>
-                      <w:sz w:val="22"/>
-                      <w:szCs w:val="22"/>
-                    </w:rPr>
-                    <w:t xml:space="preserve"> yang </w:t>
-                  </w:r>
-                  <w:proofErr w:type="spellStart"/>
-                  <w:r>
-                    <w:rPr>
-                      <w:rFonts w:asciiTheme="minorHAnsi" w:hAnsiTheme="minorHAnsi" w:cstheme="minorHAnsi"/>
-                      <w:sz w:val="22"/>
-                      <w:szCs w:val="22"/>
-                    </w:rPr>
-                    <w:t>tidak</w:t>
-                  </w:r>
-                  <w:proofErr w:type="spellEnd"/>
-                  <w:r>
-                    <w:rPr>
-                      <w:rFonts w:asciiTheme="minorHAnsi" w:hAnsiTheme="minorHAnsi" w:cstheme="minorHAnsi"/>
-                      <w:sz w:val="22"/>
-                      <w:szCs w:val="22"/>
-                    </w:rPr>
-                    <w:t xml:space="preserve"> </w:t>
-                  </w:r>
-                  <w:proofErr w:type="spellStart"/>
-                  <w:r>
-                    <w:rPr>
-                      <w:rFonts w:asciiTheme="minorHAnsi" w:hAnsiTheme="minorHAnsi" w:cstheme="minorHAnsi"/>
-                      <w:sz w:val="22"/>
-                      <w:szCs w:val="22"/>
-                    </w:rPr>
-                    <w:t>sesuai</w:t>
-                  </w:r>
-                  <w:proofErr w:type="spellEnd"/>
-                  <w:r>
-                    <w:rPr>
-                      <w:rFonts w:asciiTheme="minorHAnsi" w:hAnsiTheme="minorHAnsi" w:cstheme="minorHAnsi"/>
-                      <w:sz w:val="22"/>
-                      <w:szCs w:val="22"/>
-                    </w:rPr>
-                    <w:t xml:space="preserve"> </w:t>
-                  </w:r>
-                  <w:proofErr w:type="spellStart"/>
-                  <w:r>
-                    <w:rPr>
-                      <w:rFonts w:asciiTheme="minorHAnsi" w:hAnsiTheme="minorHAnsi" w:cstheme="minorHAnsi"/>
-                      <w:sz w:val="22"/>
-                      <w:szCs w:val="22"/>
-                    </w:rPr>
-                    <w:t>dengan</w:t>
-                  </w:r>
-                  <w:proofErr w:type="spellEnd"/>
-                  <w:r>
-                    <w:rPr>
-                      <w:rFonts w:asciiTheme="minorHAnsi" w:hAnsiTheme="minorHAnsi" w:cstheme="minorHAnsi"/>
-                      <w:sz w:val="22"/>
-                      <w:szCs w:val="22"/>
-                    </w:rPr>
-                    <w:t xml:space="preserve"> </w:t>
-                  </w:r>
-                  <w:proofErr w:type="spellStart"/>
-                  <w:r>
-                    <w:rPr>
-                      <w:rFonts w:asciiTheme="minorHAnsi" w:hAnsiTheme="minorHAnsi" w:cstheme="minorHAnsi"/>
-                      <w:sz w:val="22"/>
-                      <w:szCs w:val="22"/>
-                    </w:rPr>
-                    <w:t>pernyataan</w:t>
-                  </w:r>
-                  <w:proofErr w:type="spellEnd"/>
-                  <w:r>
-                    <w:rPr>
-                      <w:rFonts w:asciiTheme="minorHAnsi" w:hAnsiTheme="minorHAnsi" w:cstheme="minorHAnsi"/>
-                      <w:sz w:val="22"/>
-                      <w:szCs w:val="22"/>
-                    </w:rPr>
-                    <w:t xml:space="preserve"> </w:t>
-                  </w:r>
-                  <w:proofErr w:type="spellStart"/>
-                  <w:r>
-                    <w:rPr>
-                      <w:rFonts w:asciiTheme="minorHAnsi" w:hAnsiTheme="minorHAnsi" w:cstheme="minorHAnsi"/>
-                      <w:sz w:val="22"/>
-                      <w:szCs w:val="22"/>
-                    </w:rPr>
-                    <w:t>ini</w:t>
-                  </w:r>
-                  <w:proofErr w:type="spellEnd"/>
-                  <w:r>
-                    <w:rPr>
-                      <w:rFonts w:asciiTheme="minorHAnsi" w:hAnsiTheme="minorHAnsi" w:cstheme="minorHAnsi"/>
-                      <w:sz w:val="22"/>
-                      <w:szCs w:val="22"/>
-                    </w:rPr>
-                    <w:t xml:space="preserve">, </w:t>
-                  </w:r>
-                  <w:proofErr w:type="spellStart"/>
-                  <w:r>
-                    <w:rPr>
-                      <w:rFonts w:asciiTheme="minorHAnsi" w:hAnsiTheme="minorHAnsi" w:cstheme="minorHAnsi"/>
-                      <w:sz w:val="22"/>
-                      <w:szCs w:val="22"/>
-                    </w:rPr>
-                    <w:t>saya</w:t>
-                  </w:r>
-                  <w:proofErr w:type="spellEnd"/>
-                  <w:r>
-                    <w:rPr>
-                      <w:rFonts w:asciiTheme="minorHAnsi" w:hAnsiTheme="minorHAnsi" w:cstheme="minorHAnsi"/>
-                      <w:sz w:val="22"/>
-                      <w:szCs w:val="22"/>
-                    </w:rPr>
-                    <w:t xml:space="preserve"> </w:t>
-                  </w:r>
-                  <w:proofErr w:type="spellStart"/>
-                  <w:r>
-                    <w:rPr>
-                      <w:rFonts w:asciiTheme="minorHAnsi" w:hAnsiTheme="minorHAnsi" w:cstheme="minorHAnsi"/>
-                      <w:sz w:val="22"/>
-                      <w:szCs w:val="22"/>
-                    </w:rPr>
-                    <w:t>bersedia</w:t>
-                  </w:r>
-                  <w:proofErr w:type="spellEnd"/>
-                  <w:r>
-                    <w:rPr>
-                      <w:rFonts w:asciiTheme="minorHAnsi" w:hAnsiTheme="minorHAnsi" w:cstheme="minorHAnsi"/>
-                      <w:sz w:val="22"/>
-                      <w:szCs w:val="22"/>
-                    </w:rPr>
-                    <w:t xml:space="preserve"> </w:t>
-                  </w:r>
-                  <w:proofErr w:type="spellStart"/>
-                  <w:r>
-                    <w:rPr>
-                      <w:rFonts w:asciiTheme="minorHAnsi" w:hAnsiTheme="minorHAnsi" w:cstheme="minorHAnsi"/>
-                      <w:sz w:val="22"/>
-                      <w:szCs w:val="22"/>
-                    </w:rPr>
-                    <w:t>bertanggung</w:t>
-                  </w:r>
-                  <w:proofErr w:type="spellEnd"/>
-                  <w:r>
-                    <w:rPr>
-                      <w:rFonts w:asciiTheme="minorHAnsi" w:hAnsiTheme="minorHAnsi" w:cstheme="minorHAnsi"/>
-                      <w:sz w:val="22"/>
-                      <w:szCs w:val="22"/>
-                    </w:rPr>
-                    <w:t xml:space="preserve"> </w:t>
-                  </w:r>
-                  <w:proofErr w:type="spellStart"/>
-                  <w:r>
-                    <w:rPr>
-                      <w:rFonts w:asciiTheme="minorHAnsi" w:hAnsiTheme="minorHAnsi" w:cstheme="minorHAnsi"/>
-                      <w:sz w:val="22"/>
-                      <w:szCs w:val="22"/>
-                    </w:rPr>
-                    <w:t>jawab</w:t>
-                  </w:r>
-                  <w:proofErr w:type="spellEnd"/>
-                  <w:r>
-                    <w:rPr>
-                      <w:rFonts w:asciiTheme="minorHAnsi" w:hAnsiTheme="minorHAnsi" w:cstheme="minorHAnsi"/>
-                      <w:sz w:val="22"/>
-                      <w:szCs w:val="22"/>
-                    </w:rPr>
-                    <w:t xml:space="preserve"> </w:t>
-                  </w:r>
-                  <w:proofErr w:type="spellStart"/>
-                  <w:r>
-                    <w:rPr>
-                      <w:rFonts w:asciiTheme="minorHAnsi" w:hAnsiTheme="minorHAnsi" w:cstheme="minorHAnsi"/>
-                      <w:sz w:val="22"/>
-                      <w:szCs w:val="22"/>
-                    </w:rPr>
-                    <w:t>sepenuhnya</w:t>
-                  </w:r>
-                  <w:proofErr w:type="spellEnd"/>
-                  <w:r>
-                    <w:rPr>
-                      <w:rFonts w:asciiTheme="minorHAnsi" w:hAnsiTheme="minorHAnsi" w:cstheme="minorHAnsi"/>
-                      <w:sz w:val="22"/>
-                      <w:szCs w:val="22"/>
-                    </w:rPr>
-                    <w:t>.</w:t>
-                  </w:r>
-                  <w:r>
-                    <w:rPr>
-                      <w:rFonts w:asciiTheme="minorHAnsi" w:hAnsiTheme="minorHAnsi" w:cstheme="minorHAnsi"/>
-                      <w:sz w:val="22"/>
-                      <w:szCs w:val="22"/>
-                    </w:rPr>
-                    <w:br/>
+                  <w:r>
+                    <w:rPr>
+                      <w:rFonts w:asciiTheme="minorHAnsi" w:hAnsiTheme="minorHAnsi" w:cstheme="minorHAnsi"/>
+                      <w:sz w:val="22"/>
+                      <w:szCs w:val="22"/>
+                    </w:rPr>
+                    <w:t xml:space="preserve">Jakarta, </w:t>
                   </w:r>
                 </w:p>
                 <w:p>
@@ -1720,83 +710,8 @@
                       <w:sz w:val="22"/>
                       <w:szCs w:val="22"/>
                     </w:rPr>
-                    <w:t xml:space="preserve">Jakarta, </w:t>
-                  </w:r>
-                  <w:r>
-                    <w:rPr>
-                      <w:rFonts w:asciiTheme="minorHAnsi" w:hAnsiTheme="minorHAnsi" w:cstheme="minorHAnsi"/>
-                      <w:sz w:val="22"/>
-                      <w:szCs w:val="22"/>
-                    </w:rPr>
-                    <w:t>0</w:t>
-                  </w:r>
-                  <w:r>
-                    <w:rPr>
-                      <w:rFonts w:asciiTheme="minorHAnsi" w:hAnsiTheme="minorHAnsi" w:cstheme="minorHAnsi"/>
-                      <w:sz w:val="22"/>
-                      <w:szCs w:val="22"/>
-                    </w:rPr>
-                    <w:t>6</w:t>
-                  </w:r>
-                  <w:r>
-                    <w:rPr>
-                      <w:rFonts w:asciiTheme="minorHAnsi" w:hAnsiTheme="minorHAnsi" w:cstheme="minorHAnsi"/>
-                      <w:sz w:val="22"/>
-                      <w:szCs w:val="22"/>
-                    </w:rPr>
-                    <w:t xml:space="preserve"> Maret</w:t>
-                  </w:r>
-                  <w:r>
-                    <w:rPr>
-                      <w:rFonts w:asciiTheme="minorHAnsi" w:hAnsiTheme="minorHAnsi" w:cstheme="minorHAnsi"/>
-                      <w:sz w:val="22"/>
-                      <w:szCs w:val="22"/>
-                    </w:rPr>
-                    <w:t xml:space="preserve"> 202</w:t>
-                  </w:r>
-                  <w:r>
-                    <w:rPr>
-                      <w:rFonts w:asciiTheme="minorHAnsi" w:hAnsiTheme="minorHAnsi" w:cstheme="minorHAnsi"/>
-                      <w:sz w:val="22"/>
-                      <w:szCs w:val="22"/>
-                    </w:rPr>
-                    <w:t>6</w:t>
-                  </w:r>
-                </w:p>
-                <w:p>
-                  <w:pPr>
-                    <w:rPr>
-                      <w:rFonts w:asciiTheme="minorHAnsi" w:hAnsiTheme="minorHAnsi" w:cstheme="minorHAnsi"/>
-                      <w:sz w:val="22"/>
-                      <w:szCs w:val="22"/>
-                    </w:rPr>
-                  </w:pPr>
-                  <w:r>
-                    <w:rPr>
-                      <w:rFonts w:asciiTheme="minorHAnsi" w:hAnsiTheme="minorHAnsi" w:cstheme="minorHAnsi"/>
-                      <w:sz w:val="22"/>
-                      <w:szCs w:val="22"/>
-                    </w:rPr>
                     <w:br/>
-                    <w:t xml:space="preserve">Hormat </w:t>
-                  </w:r>
-                  <w:proofErr w:type="spellStart"/>
-                  <w:r>
-                    <w:rPr>
-                      <w:rFonts w:asciiTheme="minorHAnsi" w:hAnsiTheme="minorHAnsi" w:cstheme="minorHAnsi"/>
-                      <w:sz w:val="22"/>
-                      <w:szCs w:val="22"/>
-                    </w:rPr>
-                    <w:t>saya</w:t>
-                  </w:r>
-                  <w:proofErr w:type="spellEnd"/>
-                  <w:r>
-                    <w:rPr>
-                      <w:rFonts w:asciiTheme="minorHAnsi" w:hAnsiTheme="minorHAnsi" w:cstheme="minorHAnsi"/>
-                      <w:sz w:val="22"/>
-                      <w:szCs w:val="22"/>
-                    </w:rPr>
-                    <w:t>,</w:t>
+                    <w:t>Hormat saya,</w:t>
                   </w:r>
                   <w:r>
                     <w:rPr>
@@ -1846,8 +761,9 @@
                       <w:rFonts w:asciiTheme="minorHAnsi" w:hAnsiTheme="minorHAnsi" w:cstheme="minorHAnsi"/>
                       <w:sz w:val="22"/>
                       <w:szCs w:val="22"/>
-                    </w:rPr>
-                    <w:t>Mukhlis</w:t>
+                      <w:lang w:val="pt-BR"/>
+                    </w:rPr>
+                    <w:t>Mochammad Abdul Mukhlis Nurdin</w:t>
                   </w:r>
                 </w:p>
                 <w:p>
@@ -3375,6 +2291,7 @@
   <w:style w:type="character" w:default="1" w:styleId="DefaultParagraphFont">
     <w:name w:val="Default Paragraph Font"/>
     <w:uiPriority w:val="1"/>
+    <w:semiHidden/>
     <w:unhideWhenUsed/>
   </w:style>
   <w:style w:type="table" w:default="1" w:styleId="TableNormal">

</xml_diff>